<commit_message>
Fjern Nytt gulv i klasserommet
</commit_message>
<xml_diff>
--- a/nedlastinger/nytt-gulv-klasserommet.docx
+++ b/nedlastinger/nytt-gulv-klasserommet.docx
@@ -200,30 +200,22 @@
         <w:spacing w:after="100"/>
       </w:pPr>
       <w:r>
-        <w:t xml:space="preserve">Areal finner du ved å gange lengde × bredde.</w:t>
-      </w:r>
-    </w:p>
-    <w:p>
-      <w:pPr>
-        <w:spacing w:after="100"/>
-      </w:pPr>
-      <w:r>
-        <w:t xml:space="preserve">Formel: Areal = lengde × bredde</w:t>
-      </w:r>
-    </w:p>
-    <w:p>
-      <w:pPr>
-        <w:spacing w:after="80"/>
-      </w:pPr>
-      <w:r>
-        <w:rPr>
-          <w:b/>
-          <w:bCs/>
-        </w:rPr>
-        <w:t xml:space="preserve">Utregning: </w:t>
-      </w:r>
-      <w:r>
-        <w:t xml:space="preserve">________________________ cm × _____ cm = _____ cm²</w:t>
+        <w:t xml:space="preserve">Regn ut gulvarealet i cm².</w:t>
+      </w:r>
+    </w:p>
+    <w:p>
+      <w:pPr>
+        <w:spacing w:after="80"/>
+      </w:pPr>
+      <w:r>
+        <w:rPr>
+          <w:b/>
+          <w:bCs/>
+        </w:rPr>
+        <w:t xml:space="preserve">Vis utregningen din: </w:t>
+      </w:r>
+      <w:r>
+        <w:t xml:space="preserve">________________________</w:t>
       </w:r>
     </w:p>
     <w:p>
@@ -260,22 +252,14 @@
     </w:p>
     <w:p>
       <w:pPr>
-        <w:spacing w:after="100"/>
-      </w:pPr>
-      <w:r>
-        <w:t xml:space="preserve">Formel: cm² ÷ 10 000 = m²</w:t>
-      </w:r>
-    </w:p>
-    <w:p>
-      <w:pPr>
-        <w:spacing w:after="80"/>
-      </w:pPr>
-      <w:r>
-        <w:rPr>
-          <w:b/>
-          <w:bCs/>
-        </w:rPr>
-        <w:t xml:space="preserve">Vis utregningen din her: </w:t>
+        <w:spacing w:after="80"/>
+      </w:pPr>
+      <w:r>
+        <w:rPr>
+          <w:b/>
+          <w:bCs/>
+        </w:rPr>
+        <w:t xml:space="preserve">Vis utregningen din: </w:t>
       </w:r>
       <w:r>
         <w:t xml:space="preserve">________________________</w:t>
@@ -315,40 +299,17 @@
     </w:p>
     <w:p>
       <w:pPr>
-        <w:spacing w:after="100"/>
-      </w:pPr>
-      <w:r>
-        <w:t xml:space="preserve">1. Finn 5 %  →  2. Legg sammen  →  3. Gulvareal med svinn</w:t>
-      </w:r>
-    </w:p>
-    <w:p>
-      <w:pPr>
-        <w:spacing w:after="80"/>
-      </w:pPr>
-      <w:r>
-        <w:rPr>
-          <w:b/>
-          <w:bCs/>
-        </w:rPr>
-        <w:t xml:space="preserve">Finn 5 %: </w:t>
-      </w:r>
-      <w:r>
-        <w:t xml:space="preserve">________________________ m² × 0,05 = _____ m²</w:t>
-      </w:r>
-    </w:p>
-    <w:p>
-      <w:pPr>
-        <w:spacing w:after="80"/>
-      </w:pPr>
-      <w:r>
-        <w:rPr>
-          <w:b/>
-          <w:bCs/>
-        </w:rPr>
-        <w:t xml:space="preserve">Legg sammen: </w:t>
-      </w:r>
-      <w:r>
-        <w:t xml:space="preserve">________________________ m² + _____ m² = _____ m²</w:t>
+        <w:spacing w:after="80"/>
+      </w:pPr>
+      <w:r>
+        <w:rPr>
+          <w:b/>
+          <w:bCs/>
+        </w:rPr>
+        <w:t xml:space="preserve">Vis utregningen din: </w:t>
+      </w:r>
+      <w:r>
+        <w:t xml:space="preserve">________________________</w:t>
       </w:r>
     </w:p>
     <w:p>
@@ -380,30 +341,22 @@
         <w:spacing w:after="100"/>
       </w:pPr>
       <w:r>
-        <w:t xml:space="preserve">Fotlister legges langs alle fire vegger. Omkrets = summen av alle sidene.</w:t>
-      </w:r>
-    </w:p>
-    <w:p>
-      <w:pPr>
-        <w:spacing w:after="100"/>
-      </w:pPr>
-      <w:r>
-        <w:t xml:space="preserve">Formel: Omkrets = 2 × lengde + 2 × bredde</w:t>
-      </w:r>
-    </w:p>
-    <w:p>
-      <w:pPr>
-        <w:spacing w:after="80"/>
-      </w:pPr>
-      <w:r>
-        <w:rPr>
-          <w:b/>
-          <w:bCs/>
-        </w:rPr>
-        <w:t xml:space="preserve">Utregning: </w:t>
-      </w:r>
-      <w:r>
-        <w:t xml:space="preserve">________________________ (2 × _____ cm) + (2 × _____ cm) = _____ cm</w:t>
+        <w:t xml:space="preserve">Fotlister legges langs alle fire vegger. Regn ut omkretsen i cm.</w:t>
+      </w:r>
+    </w:p>
+    <w:p>
+      <w:pPr>
+        <w:spacing w:after="80"/>
+      </w:pPr>
+      <w:r>
+        <w:rPr>
+          <w:b/>
+          <w:bCs/>
+        </w:rPr>
+        <w:t xml:space="preserve">Vis utregningen din: </w:t>
+      </w:r>
+      <w:r>
+        <w:t xml:space="preserve">________________________</w:t>
       </w:r>
     </w:p>
     <w:p>
@@ -435,27 +388,19 @@
         <w:spacing w:after="100"/>
       </w:pPr>
       <w:r>
-        <w:t xml:space="preserve">Lister kjøpes i meter (m). Gjør om fra cm til m ved å dele på 100.</w:t>
-      </w:r>
-    </w:p>
-    <w:p>
-      <w:pPr>
-        <w:spacing w:after="100"/>
-      </w:pPr>
-      <w:r>
-        <w:t xml:space="preserve">Formel: cm ÷ 100 = m</w:t>
-      </w:r>
-    </w:p>
-    <w:p>
-      <w:pPr>
-        <w:spacing w:after="80"/>
-      </w:pPr>
-      <w:r>
-        <w:rPr>
-          <w:b/>
-          <w:bCs/>
-        </w:rPr>
-        <w:t xml:space="preserve">Vis utregningen din her: </w:t>
+        <w:t xml:space="preserve">Lister kjøpes i meter (m). Gjør om omkretsen fra cm til m.</w:t>
+      </w:r>
+    </w:p>
+    <w:p>
+      <w:pPr>
+        <w:spacing w:after="80"/>
+      </w:pPr>
+      <w:r>
+        <w:rPr>
+          <w:b/>
+          <w:bCs/>
+        </w:rPr>
+        <w:t xml:space="preserve">Vis utregningen din: </w:t>
       </w:r>
       <w:r>
         <w:t xml:space="preserve">________________________</w:t>
@@ -495,10 +440,17 @@
     </w:p>
     <w:p>
       <w:pPr>
-        <w:spacing w:after="100"/>
-      </w:pPr>
-      <w:r>
-        <w:t xml:space="preserve">Finn 5 % av omkretsen: multipliser omkretsen (i m) med 0,05. Legg til svinn: omkrets + svinn = totalt antall meter lister.</w:t>
+        <w:spacing w:after="80"/>
+      </w:pPr>
+      <w:r>
+        <w:rPr>
+          <w:b/>
+          <w:bCs/>
+        </w:rPr>
+        <w:t xml:space="preserve">Vis utregningen din: </w:t>
+      </w:r>
+      <w:r>
+        <w:t xml:space="preserve">________________________</w:t>
       </w:r>
     </w:p>
     <w:p>

</xml_diff>